<commit_message>
Finaliza relatório StockFlow sem figuras; ajusta referências e layout
Co-Authored-By: Claude Sonnet 5.5 <noreply@anthropic.com>
Claude-Session: https://claude.ai/code/session_01HaYTgjpyNQEjDvkMvuract
</commit_message>
<xml_diff>
--- a/entrega/Projeto_Software_StockFlow_Hadrian_Rafael_FINAL.docx
+++ b/entrega/Projeto_Software_StockFlow_Hadrian_Rafael_FINAL.docx
@@ -382,7 +382,7 @@
           <w:sz w:val="24"/>
           <w:szCs w:val="24"/>
         </w:rPr>
-        <w:t xml:space="preserve">	6</w:t>
+        <w:t xml:space="preserve">	5</w:t>
       </w:r>
     </w:p>
     <w:p>
@@ -410,7 +410,7 @@
           <w:sz w:val="24"/>
           <w:szCs w:val="24"/>
         </w:rPr>
-        <w:t xml:space="preserve">	6</w:t>
+        <w:t xml:space="preserve">	5</w:t>
       </w:r>
     </w:p>
     <w:p>
@@ -438,7 +438,7 @@
           <w:sz w:val="24"/>
           <w:szCs w:val="24"/>
         </w:rPr>
-        <w:t xml:space="preserve">	6</w:t>
+        <w:t xml:space="preserve">	5</w:t>
       </w:r>
     </w:p>
     <w:p>
@@ -578,7 +578,7 @@
           <w:sz w:val="24"/>
           <w:szCs w:val="24"/>
         </w:rPr>
-        <w:t xml:space="preserve">	8</w:t>
+        <w:t xml:space="preserve">	7</w:t>
       </w:r>
     </w:p>
     <w:p>
@@ -606,7 +606,7 @@
           <w:sz w:val="24"/>
           <w:szCs w:val="24"/>
         </w:rPr>
-        <w:t xml:space="preserve">	9</w:t>
+        <w:t xml:space="preserve">	8</w:t>
       </w:r>
     </w:p>
     <w:p>
@@ -662,7 +662,7 @@
           <w:sz w:val="24"/>
           <w:szCs w:val="24"/>
         </w:rPr>
-        <w:t xml:space="preserve">	11</w:t>
+        <w:t xml:space="preserve">	10</w:t>
       </w:r>
     </w:p>
     <w:p>
@@ -690,7 +690,7 @@
           <w:sz w:val="24"/>
           <w:szCs w:val="24"/>
         </w:rPr>
-        <w:t xml:space="preserve">	14</w:t>
+        <w:t xml:space="preserve">	13</w:t>
       </w:r>
     </w:p>
     <w:p>
@@ -718,7 +718,7 @@
           <w:sz w:val="24"/>
           <w:szCs w:val="24"/>
         </w:rPr>
-        <w:t xml:space="preserve">	14</w:t>
+        <w:t xml:space="preserve">	13</w:t>
       </w:r>
     </w:p>
     <w:p>
@@ -746,7 +746,7 @@
           <w:sz w:val="24"/>
           <w:szCs w:val="24"/>
         </w:rPr>
-        <w:t xml:space="preserve">	15</w:t>
+        <w:t xml:space="preserve">	14</w:t>
       </w:r>
     </w:p>
     <w:p>
@@ -774,7 +774,7 @@
           <w:sz w:val="24"/>
           <w:szCs w:val="24"/>
         </w:rPr>
-        <w:t xml:space="preserve">	16</w:t>
+        <w:t xml:space="preserve">	14</w:t>
       </w:r>
     </w:p>
     <w:p>
@@ -802,7 +802,7 @@
           <w:sz w:val="24"/>
           <w:szCs w:val="24"/>
         </w:rPr>
-        <w:t xml:space="preserve">	16</w:t>
+        <w:t xml:space="preserve">	15</w:t>
       </w:r>
     </w:p>
     <w:p>
@@ -830,7 +830,7 @@
           <w:sz w:val="24"/>
           <w:szCs w:val="24"/>
         </w:rPr>
-        <w:t xml:space="preserve">	16</w:t>
+        <w:t xml:space="preserve">	15</w:t>
       </w:r>
     </w:p>
     <w:p>
@@ -858,7 +858,7 @@
           <w:sz w:val="24"/>
           <w:szCs w:val="24"/>
         </w:rPr>
-        <w:t xml:space="preserve">	17</w:t>
+        <w:t xml:space="preserve">	15</w:t>
       </w:r>
     </w:p>
     <w:p>
@@ -886,7 +886,7 @@
           <w:sz w:val="24"/>
           <w:szCs w:val="24"/>
         </w:rPr>
-        <w:t xml:space="preserve">	17</w:t>
+        <w:t xml:space="preserve">	16</w:t>
       </w:r>
     </w:p>
     <w:p>
@@ -914,7 +914,7 @@
           <w:sz w:val="24"/>
           <w:szCs w:val="24"/>
         </w:rPr>
-        <w:t xml:space="preserve">	17</w:t>
+        <w:t xml:space="preserve">	16</w:t>
       </w:r>
     </w:p>
     <w:p>
@@ -942,7 +942,7 @@
           <w:sz w:val="24"/>
           <w:szCs w:val="24"/>
         </w:rPr>
-        <w:t xml:space="preserve">	17</w:t>
+        <w:t xml:space="preserve">	16</w:t>
       </w:r>
     </w:p>
     <w:p>
@@ -970,7 +970,7 @@
           <w:sz w:val="24"/>
           <w:szCs w:val="24"/>
         </w:rPr>
-        <w:t xml:space="preserve">	18</w:t>
+        <w:t xml:space="preserve">	16</w:t>
       </w:r>
     </w:p>
     <w:p>
@@ -998,7 +998,7 @@
           <w:sz w:val="24"/>
           <w:szCs w:val="24"/>
         </w:rPr>
-        <w:t xml:space="preserve">	18</w:t>
+        <w:t xml:space="preserve">	17</w:t>
       </w:r>
     </w:p>
     <w:p>
@@ -1026,7 +1026,7 @@
           <w:sz w:val="24"/>
           <w:szCs w:val="24"/>
         </w:rPr>
-        <w:t xml:space="preserve">	18</w:t>
+        <w:t xml:space="preserve">	17</w:t>
       </w:r>
     </w:p>
     <w:p>
@@ -1054,7 +1054,7 @@
           <w:sz w:val="24"/>
           <w:szCs w:val="24"/>
         </w:rPr>
-        <w:t xml:space="preserve">	19</w:t>
+        <w:t xml:space="preserve">	17</w:t>
       </w:r>
     </w:p>
     <w:p>
@@ -1082,7 +1082,7 @@
           <w:sz w:val="24"/>
           <w:szCs w:val="24"/>
         </w:rPr>
-        <w:t xml:space="preserve">	19</w:t>
+        <w:t xml:space="preserve">	18</w:t>
       </w:r>
     </w:p>
     <w:p>
@@ -1457,7 +1457,6 @@
       <w:pPr>
         <w:pStyle w:val="Heading1"/>
         <w:keepNext/>
-        <w:pageBreakBefore/>
         <w:spacing w:after="240" w:before="360"/>
       </w:pPr>
       <w:r>
@@ -5210,7 +5209,7 @@
                 <w:sz w:val="20"/>
                 <w:szCs w:val="20"/>
               </w:rPr>
-              <w:t xml:space="preserve">Coleta mínima de dados pessoais (nome e e-mail), em conformidade com a Lei Geral de Proteção de Dados (Lei nº 13.709/2018).</w:t>
+              <w:t xml:space="preserve">Coleta mínima de dados pessoais (nome e e-mail), em conformidade com a Lei Geral de Proteção de Dados (BRASIL, 2018).</w:t>
             </w:r>
           </w:p>
         </w:tc>
@@ -16303,7 +16302,6 @@
       <w:pPr>
         <w:pStyle w:val="Heading1"/>
         <w:keepNext/>
-        <w:pageBreakBefore/>
         <w:spacing w:after="240" w:before="360"/>
       </w:pPr>
       <w:r>
@@ -16330,61 +16328,7 @@
           <w:sz w:val="24"/>
           <w:szCs w:val="24"/>
         </w:rPr>
-        <w:t xml:space="preserve">O quadro do projeto foi criado no Trello (https://trello.com), plataforma gratuita listada no roteiro da atividade, com o nome “StockFlow – Projeto de Software – Hadrian Rafael”. O Trello organiza o trabalho em quadros, listas e cartões: as listas representam as etapas do fluxo e os cartões representam os itens de trabalho, que se movem da esquerda para a direita conforme avançam. A Figura 1 apresenta a visão geral do quadro.</w:t>
-      </w:r>
-    </w:p>
-    <w:p>
-      <w:pPr>
-        <w:keepNext/>
-        <w:spacing w:after="80" w:before="200"/>
-        <w:jc w:val="center"/>
-      </w:pPr>
-      <w:r>
-        <w:rPr>
-          <w:rFonts w:ascii="Times New Roman" w:cs="Times New Roman" w:eastAsia="Times New Roman" w:hAnsi="Times New Roman"/>
-          <w:b/>
-          <w:bCs/>
-          <w:sz w:val="20"/>
-          <w:szCs w:val="20"/>
-        </w:rPr>
-        <w:t xml:space="preserve">Figura 1 – Visão geral do quadro Scrum/Kanban do StockFlow no Trello</w:t>
-      </w:r>
-    </w:p>
-    <w:p>
-      <w:pPr>
-        <w:pBdr>
-          <w:top w:val="single" w:color="808080" w:sz="4"/>
-          <w:bottom w:val="single" w:color="808080" w:sz="4"/>
-          <w:left w:val="single" w:color="808080" w:sz="4"/>
-          <w:right w:val="single" w:color="808080" w:sz="4"/>
-        </w:pBdr>
-        <w:shd w:fill="F2F2F2" w:color="auto" w:val="clear"/>
-        <w:spacing w:after="120" w:before="120"/>
-        <w:jc w:val="center"/>
-      </w:pPr>
-      <w:r>
-        <w:rPr>
-          <w:rFonts w:ascii="Times New Roman" w:cs="Times New Roman" w:eastAsia="Times New Roman" w:hAnsi="Times New Roman"/>
-          <w:i/>
-          <w:iCs/>
-          <w:sz w:val="20"/>
-          <w:szCs w:val="20"/>
-        </w:rPr>
-        <w:t xml:space="preserve">Captura de tela real do Trello pendente de inserção (arquivo figura1.png).</w:t>
-      </w:r>
-    </w:p>
-    <w:p>
-      <w:pPr>
-        <w:spacing w:after="240" w:before="60"/>
-        <w:jc w:val="center"/>
-      </w:pPr>
-      <w:r>
-        <w:rPr>
-          <w:rFonts w:ascii="Times New Roman" w:cs="Times New Roman" w:eastAsia="Times New Roman" w:hAnsi="Times New Roman"/>
-          <w:sz w:val="20"/>
-          <w:szCs w:val="20"/>
-        </w:rPr>
-        <w:t xml:space="preserve">Fonte: captura de tela do quadro do projeto no Trello (2026).</w:t>
+        <w:t xml:space="preserve">O quadro do projeto foi criado no Trello (https://trello.com), plataforma gratuita listada no roteiro da atividade (TRELLO, 2026), com o nome “StockFlow – Projeto de Software – Hadrian Rafael”. O quadro é privado, de acesso restrito ao autor, e seu endereço é https://trello.com/b/01ysooUM/stockflow-projeto-de-software-hadrian-rafael. O Trello organiza o trabalho em quadros, listas e cartões: as listas representam as etapas do fluxo e os cartões representam os itens de trabalho, que se movem da esquerda para a direita conforme avançam. Nas subseções seguintes descrevem-se a estrutura das listas, o padrão dos cartões, a distribuição das tarefas e o acompanhamento.</w:t>
       </w:r>
     </w:p>
     <w:p>
@@ -17598,61 +17542,7 @@
           <w:sz w:val="24"/>
           <w:szCs w:val="24"/>
         </w:rPr>
-        <w:t xml:space="preserve"> “Tarefas” quebra o item em atividades técnicas, e os itens já realizados aparecem marcados. Os cartões concluídos foram marcados como completos. A Figura 2 mostra um exemplo de cartão com descrição, prazo, prioridade e checklist.</w:t>
-      </w:r>
-    </w:p>
-    <w:p>
-      <w:pPr>
-        <w:keepNext/>
-        <w:spacing w:after="80" w:before="200"/>
-        <w:jc w:val="center"/>
-      </w:pPr>
-      <w:r>
-        <w:rPr>
-          <w:rFonts w:ascii="Times New Roman" w:cs="Times New Roman" w:eastAsia="Times New Roman" w:hAnsi="Times New Roman"/>
-          <w:b/>
-          <w:bCs/>
-          <w:sz w:val="20"/>
-          <w:szCs w:val="20"/>
-        </w:rPr>
-        <w:t xml:space="preserve">Figura 2 – Exemplo de cartão com descrição, prazo, prioridade e checklist (PB11 – Alertas de estoque baixo)</w:t>
-      </w:r>
-    </w:p>
-    <w:p>
-      <w:pPr>
-        <w:pBdr>
-          <w:top w:val="single" w:color="808080" w:sz="4"/>
-          <w:bottom w:val="single" w:color="808080" w:sz="4"/>
-          <w:left w:val="single" w:color="808080" w:sz="4"/>
-          <w:right w:val="single" w:color="808080" w:sz="4"/>
-        </w:pBdr>
-        <w:shd w:fill="F2F2F2" w:color="auto" w:val="clear"/>
-        <w:spacing w:after="120" w:before="120"/>
-        <w:jc w:val="center"/>
-      </w:pPr>
-      <w:r>
-        <w:rPr>
-          <w:rFonts w:ascii="Times New Roman" w:cs="Times New Roman" w:eastAsia="Times New Roman" w:hAnsi="Times New Roman"/>
-          <w:i/>
-          <w:iCs/>
-          <w:sz w:val="20"/>
-          <w:szCs w:val="20"/>
-        </w:rPr>
-        <w:t xml:space="preserve">Captura de tela real do Trello pendente de inserção (arquivo figura2.png).</w:t>
-      </w:r>
-    </w:p>
-    <w:p>
-      <w:pPr>
-        <w:spacing w:after="240" w:before="60"/>
-        <w:jc w:val="center"/>
-      </w:pPr>
-      <w:r>
-        <w:rPr>
-          <w:rFonts w:ascii="Times New Roman" w:cs="Times New Roman" w:eastAsia="Times New Roman" w:hAnsi="Times New Roman"/>
-          <w:sz w:val="20"/>
-          <w:szCs w:val="20"/>
-        </w:rPr>
-        <w:t xml:space="preserve">Fonte: captura de tela do quadro do projeto no Trello (2026).</w:t>
+        <w:t xml:space="preserve"> “Tarefas” quebra o item em atividades técnicas, e os itens já realizados aparecem marcados. Os cartões concluídos foram marcados como completos. Como exemplo, o cartão “PB11 – Alertas de estoque baixo [Alta | 5 pts]”, na lista Em Progresso, tem prazo em 07/10/2026, prioridade Alta (Must have), valor de negócio 88/100, responsáveis Dev Back-end e Dev Front-end, três critérios de aceite e uma checklist de quatro tarefas, das quais duas estão marcadas como concluídas.</w:t>
       </w:r>
     </w:p>
     <w:p>
@@ -17699,61 +17589,7 @@
           <w:sz w:val="24"/>
           <w:szCs w:val="24"/>
         </w:rPr>
-        <w:t xml:space="preserve">A Figura 3 evidencia a distribuição dos cartões entre as etapas, e a Tabela 7 a resume numericamente. Há cartões em todas as listas, conforme exigido pelo roteiro, de modo que o quadro representa um projeto em estágio avançado: dez itens concluídos, dois em revisão e testes, dois em progresso, dois comprometidos na Sprint e onze aguardando nas próximas Sprints.</w:t>
-      </w:r>
-    </w:p>
-    <w:p>
-      <w:pPr>
-        <w:keepNext/>
-        <w:spacing w:after="80" w:before="200"/>
-        <w:jc w:val="center"/>
-      </w:pPr>
-      <w:r>
-        <w:rPr>
-          <w:rFonts w:ascii="Times New Roman" w:cs="Times New Roman" w:eastAsia="Times New Roman" w:hAnsi="Times New Roman"/>
-          <w:b/>
-          <w:bCs/>
-          <w:sz w:val="20"/>
-          <w:szCs w:val="20"/>
-        </w:rPr>
-        <w:t xml:space="preserve">Figura 3 – Tarefas distribuídas entre as diferentes etapas do projeto</w:t>
-      </w:r>
-    </w:p>
-    <w:p>
-      <w:pPr>
-        <w:pBdr>
-          <w:top w:val="single" w:color="808080" w:sz="4"/>
-          <w:bottom w:val="single" w:color="808080" w:sz="4"/>
-          <w:left w:val="single" w:color="808080" w:sz="4"/>
-          <w:right w:val="single" w:color="808080" w:sz="4"/>
-        </w:pBdr>
-        <w:shd w:fill="F2F2F2" w:color="auto" w:val="clear"/>
-        <w:spacing w:after="120" w:before="120"/>
-        <w:jc w:val="center"/>
-      </w:pPr>
-      <w:r>
-        <w:rPr>
-          <w:rFonts w:ascii="Times New Roman" w:cs="Times New Roman" w:eastAsia="Times New Roman" w:hAnsi="Times New Roman"/>
-          <w:i/>
-          <w:iCs/>
-          <w:sz w:val="20"/>
-          <w:szCs w:val="20"/>
-        </w:rPr>
-        <w:t xml:space="preserve">Captura de tela real do Trello pendente de inserção (arquivo figura3.png).</w:t>
-      </w:r>
-    </w:p>
-    <w:p>
-      <w:pPr>
-        <w:spacing w:after="240" w:before="60"/>
-        <w:jc w:val="center"/>
-      </w:pPr>
-      <w:r>
-        <w:rPr>
-          <w:rFonts w:ascii="Times New Roman" w:cs="Times New Roman" w:eastAsia="Times New Roman" w:hAnsi="Times New Roman"/>
-          <w:sz w:val="20"/>
-          <w:szCs w:val="20"/>
-        </w:rPr>
-        <w:t xml:space="preserve">Fonte: captura de tela do quadro do projeto no Trello (2026).</w:t>
+        <w:t xml:space="preserve">A Tabela 7 resume a distribuição dos cartões entre as etapas. Em Concluído estão PB01 a PB08, PB19 e PB10; em Em Revisão/Testes, PB09 e BUG-07; em Em Progresso, PB11 e PB12; em Sprint 3 – A Fazer, PB13 e TEC-03; e no Product Backlog, PB14 a PB18 e PB20 a PB25. Há cartões em todas as listas, conforme exigido pelo roteiro, de modo que o quadro representa um projeto em estágio avançado: dez itens concluídos, dois em revisão e testes, dois em progresso, dois comprometidos na Sprint e onze aguardando nas próximas Sprints.</w:t>
       </w:r>
     </w:p>
     <w:p>
@@ -18273,7 +18109,7 @@
           <w:sz w:val="24"/>
           <w:szCs w:val="24"/>
         </w:rPr>
-        <w:t xml:space="preserve">. Lei Geral de Proteção de Dados Pessoais (LGPD). Brasília, DF: Presidência da República, 2018.</w:t>
+        <w:t xml:space="preserve">. Lei Geral de Proteção de Dados Pessoais (LGPD). Diário Oficial da União: seção 1, Brasília, DF, 15 ago. 2018.</w:t>
       </w:r>
     </w:p>
     <w:p>
@@ -18369,7 +18205,7 @@
           <w:sz w:val="24"/>
           <w:szCs w:val="24"/>
         </w:rPr>
-        <w:t xml:space="preserve">: the definitive guide to Scrum: the rules of the game. 2020. Disponível em: https://scrumguides.org/scrum-guide.html. Acesso em: 1 out. 2026.</w:t>
+        <w:t xml:space="preserve">: the definitive guide to Scrum: the rules of the game. [S. l.]: Scrum.org, 2020. Disponível em: https://scrumguides.org/scrum-guide.html. Acesso em: 1 out. 2026.</w:t>
       </w:r>
     </w:p>
     <w:p>
@@ -18433,7 +18269,7 @@
           <w:sz w:val="24"/>
           <w:szCs w:val="24"/>
         </w:rPr>
-        <w:t xml:space="preserve">: guia de introdução. Disponível em: https://trello.com/guide. Acesso em: 1 out. 2026.</w:t>
+        <w:t xml:space="preserve">. Disponível em: https://trello.com. Acesso em: 1 out. 2026.</w:t>
       </w:r>
     </w:p>
     <w:sectPr>

</xml_diff>